<commit_message>
Add Flask-Migrate migrations + production config
</commit_message>
<xml_diff>
--- a/backend/services/generated_files/generated_cover_letter.docx
+++ b/backend/services/generated_files/generated_cover_letter.docx
@@ -603,7 +603,7 @@
                 <w:sz w:val="22"/>
                 <w:szCs w:val="22"/>
               </w:rPr>
-              <w:t xml:space="preserve">06 March 2026</w:t>
+              <w:t xml:space="preserve">07 March 2026</w:t>
             </w:r>
           </w:p>
           <w:p>
@@ -635,7 +635,7 @@
                 <w:sz w:val="22"/>
                 <w:szCs w:val="22"/>
               </w:rPr>
-              <w:t xml:space="preserve">Job details</w:t>
+              <w:t xml:space="preserve">Application</w:t>
             </w:r>
           </w:p>
           <w:p>
@@ -660,7 +660,7 @@
               </w:rPr>
               <w:t xml:space="preserve">
                 <w:r>
-                  <w:t xml:space="preserve">The opportunity to join your team as a QA Tester is particularly compelling due to the focus on ensuring the quality and performance of web applications built on the Laravel framework. The challenge of designing and executing rigorous test plans, while collaborating with developers to enhance software reliability, aligns perfectly with my passion for meticulous software testing and automation.</w:t>
+                  <w:t xml:space="preserve">The opportunity to contribute to your team as a QA Tester, particularly in ensuring the quality and reliability of Laravel-based web applications, aligns perfectly with my passion for developing robust software solutions. The emphasis on close collaboration with developers and commitment to continuous QA process improvement is exactly the environment I thrive in.</w:t>
                 </w:r>
                 <w:r>
                   <w:t xml:space="preserve"/>
@@ -682,7 +682,7 @@
                   <w:t xml:space="preserve"/>
                 </w:r>
                 <w:r>
-                  <w:t xml:space="preserve">During my time at Stellenbosch University, I designed and built automation scripts using Python, JavaScript, and Google Apps Script, specifically to streamline repetitive academic processes. One notable achievement was developing document-processing automations to efficiently handle large volumes of structured text. These experiences have honed my ability to identify and solve complex problems, a critical skill for rigorous QA testing.</w:t>
+                  <w:t xml:space="preserve">During my time at Stellenbosch University, I designed and implemented automation scripts using Python, JavaScript, and Google Apps Script, which significantly streamlined repetitive academic and content-generation workflows. This experience honed my ability to develop efficient, automated solutions and aligns well with the need for automated test case development in your role. Additionally, my project work involving document-processing automations provided me with a strong foundation in identifying and solving applied problems, similar to those faced in software testing.</w:t>
                 </w:r>
                 <w:r>
                   <w:t xml:space="preserve"/>
@@ -704,7 +704,7 @@
                   <w:t xml:space="preserve"/>
                 </w:r>
                 <w:r>
-                  <w:t xml:space="preserve">My technical skills in Python, JavaScript, and Git, coupled with my knowledge of software and automation, align well with the requirements of the role. Although my direct experience with Laravel is limited, my strong foundation in software development and my ability to quickly adapt to new technologies will enable me to effectively engage with Laravel-based applications. Additionally, my familiarity with version control systems like Git/GitHub and my experience in designing and executing test cases in agile environments will allow me to contribute meaningfully to your continuous improvement efforts.</w:t>
+                  <w:t xml:space="preserve">My skills in Python, JavaScript, and object-oriented programming are complemented by my proficiency in version control systems like Git and GitHub, which are essential for maintaining efficient workflows as outlined in your job description. Furthermore, my grounding in technical documentation and data analysis supports my capability to execute thorough and precise test plans and to communicate effectively with development teams.</w:t>
                 </w:r>
                 <w:r>
                   <w:t xml:space="preserve"/>
@@ -726,7 +726,7 @@
                   <w:t xml:space="preserve"/>
                 </w:r>
                 <w:r>
-                  <w:t xml:space="preserve">I am eager to leverage my skills and experience in a role that demands a keen eye for detail and a commitment to high-quality software delivery. I look forward to discussing how I can contribute to the company’s success as a QA Tester. I am available at your convenience for an interview.</w:t>
+                  <w:t xml:space="preserve">I am eager to bring my background in software and automation to the QA Tester position, contributing to the high standards of quality and reliability your team upholds. I look forward to the possibility of discussing how I can contribute to your team’s success and am keen to explore this opportunity further in an interview.</w:t>
                 </w:r>
                 <w:r>
                   <w:t xml:space="preserve"/>
@@ -878,7 +878,7 @@
                     <a:graphicData uri="http://schemas.openxmlformats.org/drawingml/2006/picture">
                       <pic:pic>
                         <pic:nvPicPr>
-                          <pic:cNvPr id="0" name="tmpaqzmd71h.png"/>
+                          <pic:cNvPr id="0" name="tmpi08s_ohi.png"/>
                           <pic:cNvPicPr/>
                         </pic:nvPicPr>
                         <pic:blipFill>

</xml_diff>